<commit_message>
fix: complete listening plan editing and verify final release candidate
</commit_message>
<xml_diff>
--- a/docs/交付/V3操作手册-20261007.docx
+++ b/docs/交付/V3操作手册-20261007.docx
@@ -665,13 +665,9 @@
       </w:r>
     </w:p>
     <w:p>
-      <w:r>
-        <w:br w:type="page"/>
-      </w:r>
-    </w:p>
-    <w:p>
       <w:pPr>
         <w:pStyle w:val="Heading1"/>
+        <w:pageBreakBefore/>
       </w:pPr>
       <w:r>
         <w:t>查看不同学期</w:t>
@@ -732,13 +728,9 @@
       </w:r>
     </w:p>
     <w:p>
-      <w:r>
-        <w:br w:type="page"/>
-      </w:r>
-    </w:p>
-    <w:p>
       <w:pPr>
         <w:pStyle w:val="Heading1"/>
+        <w:pageBreakBefore/>
       </w:pPr>
       <w:r>
         <w:t>安排听课和填写评价</w:t>
@@ -757,7 +749,7 @@
         <w:pStyle w:val="ListNumber"/>
       </w:pPr>
       <w:r>
-        <w:t>选择计划周次并加入计划。已评价的周次不可重复选择；未指定周次的计划，填写评价时自行核对实际日期。</w:t>
+        <w:t>选择计划周次并加入计划。尚未关联评价的待听课计划可点击“修改计划”调整周次和备注；草稿或正式评价已经关联后不可改动计划。已占用的周次不可重复选择；未指定周次的计划，填写评价时自行核对实际日期。</w:t>
       </w:r>
     </w:p>
     <w:p>
@@ -847,13 +839,9 @@
       </w:r>
     </w:p>
     <w:p>
-      <w:r>
-        <w:br w:type="page"/>
-      </w:r>
-    </w:p>
-    <w:p>
       <w:pPr>
         <w:pStyle w:val="Heading1"/>
+        <w:pageBreakBefore/>
       </w:pPr>
       <w:r>
         <w:t>查看和打印评价</w:t>
@@ -920,13 +908,9 @@
       </w:r>
     </w:p>
     <w:p>
-      <w:r>
-        <w:br w:type="page"/>
-      </w:r>
-    </w:p>
-    <w:p>
       <w:pPr>
         <w:pStyle w:val="Heading1"/>
+        <w:pageBreakBefore/>
       </w:pPr>
       <w:r>
         <w:t>查看统计和维护资料</w:t>
@@ -945,7 +929,7 @@
       <w:r>
         <w:drawing>
           <wp:inline xmlns:a="http://schemas.openxmlformats.org/drawingml/2006/main" xmlns:pic="http://schemas.openxmlformats.org/drawingml/2006/picture">
-            <wp:extent cx="6192000" cy="4153800"/>
+            <wp:extent cx="5098136" cy="3420000"/>
             <wp:docPr id="4" name="Picture 4"/>
             <wp:cNvGraphicFramePr>
               <a:graphicFrameLocks noChangeAspect="1"/>
@@ -966,7 +950,7 @@
                   <pic:spPr>
                     <a:xfrm>
                       <a:off x="0" y="0"/>
-                      <a:ext cx="6192000" cy="4153800"/>
+                      <a:ext cx="5098136" cy="3420000"/>
                     </a:xfrm>
                     <a:prstGeom prst="rect"/>
                   </pic:spPr>

</xml_diff>

<commit_message>
feat: support confirmed independent MBA semester calendar
</commit_message>
<xml_diff>
--- a/docs/交付/V3操作手册-20261007.docx
+++ b/docs/交付/V3操作手册-20261007.docx
@@ -757,7 +757,7 @@
         <w:pStyle w:val="ListNumber"/>
       </w:pPr>
       <w:r>
-        <w:t>“听课计划”进入“填写评价”。所选计划及计划周次会带入评分表，日期先显示该周周一；按实际听课日期修改，周次自动对应。2026年秋季第一周从9月14日开始。</w:t>
+        <w:t>“听课计划”进入“填写评价”。计划和周次会带入评分表，日期先显示该周周一；按实际听课日期修改。普通课第一周从9月14日起，MBA按独立周历，9月12、13日属于第一周。</w:t>
       </w:r>
     </w:p>
     <w:p>
@@ -993,7 +993,7 @@
     <w:p>
       <w:pPr/>
       <w:r>
-        <w:t>记录操作页面、所选学期和错误提示，联系研究生院管理员。不要发送密码、会话或完整敏感评价截图。MBA原表第一周之前的场次及缺教师记录等待核查，不能自行把学校第一周改为9月7日。公网地址与学校域名以正式发布通知为准。</w:t>
+        <w:t>记录操作页面、所选学期和错误提示，联系研究生院管理员。不要发送密码、会话或完整敏感评价截图。MBA原缺教师课程保留待核，暂不能安排听课或评分；独立周历不会改变普通课9月14日第一周。公网地址与学校域名以正式发布通知为准。</w:t>
       </w:r>
     </w:p>
     <w:sectPr>

</xml_diff>

<commit_message>
Unify school calendar from September 14 and preserve preterm MBA sessions
</commit_message>
<xml_diff>
--- a/docs/交付/V3操作手册-20261007.docx
+++ b/docs/交付/V3操作手册-20261007.docx
@@ -15,7 +15,7 @@
         <w:pStyle w:val="Subtitle"/>
       </w:pPr>
       <w:r>
-        <w:t>2026年10月7日</w:t>
+        <w:t>2026年10月16日校历修订版</w:t>
       </w:r>
     </w:p>
     <w:p>
@@ -681,6 +681,7 @@
     </w:p>
     <w:p>
       <w:pPr>
+        <w:keepNext/>
         <w:jc w:val="center"/>
       </w:pPr>
       <w:r>
@@ -757,7 +758,7 @@
         <w:pStyle w:val="ListNumber"/>
       </w:pPr>
       <w:r>
-        <w:t>“听课计划”进入“填写评价”。计划和周次会带入评分表，日期先显示该周周一；按实际听课日期修改。普通课第一周从9月14日起，MBA按独立周历，9月12、13日属于第一周。</w:t>
+        <w:t>“听课计划”进入“填写评价”。计划和周次会带入评分表，日期先显示该周周一；按实际听课日期修改。所有学院（含MBA）第一周从9月14日起；此前场次保留为“开学前（第0周）”，正常计划和评分从第一周开始。</w:t>
       </w:r>
     </w:p>
     <w:p>
@@ -792,12 +793,13 @@
     </w:p>
     <w:p>
       <w:pPr>
+        <w:keepNext/>
         <w:jc w:val="center"/>
       </w:pPr>
       <w:r>
         <w:drawing>
           <wp:inline xmlns:a="http://schemas.openxmlformats.org/drawingml/2006/main" xmlns:pic="http://schemas.openxmlformats.org/drawingml/2006/picture">
-            <wp:extent cx="1835999" cy="3973290"/>
+            <wp:extent cx="1655999" cy="3583752"/>
             <wp:docPr id="2" name="Picture 2"/>
             <wp:cNvGraphicFramePr>
               <a:graphicFrameLocks noChangeAspect="1"/>
@@ -818,7 +820,7 @@
                   <pic:spPr>
                     <a:xfrm>
                       <a:off x="0" y="0"/>
-                      <a:ext cx="1835999" cy="3973290"/>
+                      <a:ext cx="1655999" cy="3583752"/>
                     </a:xfrm>
                     <a:prstGeom prst="rect"/>
                   </pic:spPr>
@@ -861,6 +863,7 @@
     </w:p>
     <w:p>
       <w:pPr>
+        <w:keepNext/>
         <w:jc w:val="center"/>
       </w:pPr>
       <w:r>
@@ -924,6 +927,7 @@
     </w:p>
     <w:p>
       <w:pPr>
+        <w:keepNext/>
         <w:jc w:val="center"/>
       </w:pPr>
       <w:r>
@@ -993,7 +997,7 @@
     <w:p>
       <w:pPr/>
       <w:r>
-        <w:t>记录操作页面、所选学期和错误提示，联系研究生院管理员。不要发送密码、会话或完整敏感评价截图。MBA原缺教师课程保留待核，暂不能安排听课或评分；独立周历不会改变普通课9月14日第一周。公网地址与学校域名以正式发布通知为准。</w:t>
+        <w:t>记录操作页面、所选学期和错误提示，联系研究生院管理员。不要发送密码、会话或完整敏感评价截图。MBA原缺教师课程保留待核，暂不能安排听课或评分；2026年秋季全校统一9月14日第一周（10月16日校历修订）。公网入口：https://121.196.217.243/login ，学校域名后续接入。</w:t>
       </w:r>
     </w:p>
     <w:sectPr>

</xml_diff>